<commit_message>
docs: add chapter 12 (external data sources) + html-entity dedup
Co-Authored-By: Devin AI <158243242+devin-ai-integration[bot]@users.noreply.github.com>
</commit_message>
<xml_diff>
--- a/docs/RUMAH_KARIR_Dokumentasi.docx
+++ b/docs/RUMAH_KARIR_Dokumentasi.docx
@@ -3468,6 +3468,2052 @@
     </w:p>
     <w:p>
       <w:r>
+        <w:br w:type="page"/>
+      </w:r>
+    </w:p>
+    <w:p>
+      <w:pPr>
+        <w:pStyle w:val="Heading1"/>
+      </w:pPr>
+      <w:r>
+        <w:t>12. Sumber Data Lowongan &amp; Integrasi API Eksternal</w:t>
+      </w:r>
+    </w:p>
+    <w:p>
+      <w:r>
+        <w:rPr>
+          <w:sz w:val="22"/>
+        </w:rPr>
+        <w:t>Database lowongan diisi dengan kombinasi data hasil scraping job board publik dan REST API gratis. Semua data diambil dengan rate limit konservatif dan disimpan sebagai snapshot JSON di scrapers/data/* sebelum di-import ke SQLite. Importer bersifat idempotent: perusahaan di-dedup case-insensitive berdasarkan nama dan lowongan di-dedup berdasarkan (company_id, title).</w:t>
+      </w:r>
+    </w:p>
+    <w:p>
+      <w:pPr>
+        <w:pStyle w:val="Heading2"/>
+      </w:pPr>
+      <w:r>
+        <w:t>12.1 Ringkasan sumber data</w:t>
+      </w:r>
+    </w:p>
+    <w:tbl>
+      <w:tblPr>
+        <w:tblStyle w:val="LightGrid-Accent1"/>
+        <w:tblW w:type="auto" w:w="0"/>
+        <w:tblLook w:firstColumn="1" w:firstRow="1" w:lastColumn="0" w:lastRow="0" w:noHBand="0" w:noVBand="1" w:val="04A0"/>
+      </w:tblPr>
+      <w:tblGrid>
+        <w:gridCol w:w="1728"/>
+        <w:gridCol w:w="1728"/>
+        <w:gridCol w:w="1728"/>
+        <w:gridCol w:w="1728"/>
+        <w:gridCol w:w="1728"/>
+      </w:tblGrid>
+      <w:tr>
+        <w:tc>
+          <w:tcPr>
+            <w:tcW w:type="dxa" w:w="1728"/>
+          </w:tcPr>
+          <w:p>
+            <w:r>
+              <w:t>Sumber</w:t>
+            </w:r>
+          </w:p>
+        </w:tc>
+        <w:tc>
+          <w:tcPr>
+            <w:tcW w:type="dxa" w:w="1728"/>
+          </w:tcPr>
+          <w:p>
+            <w:r>
+              <w:t>Tipe</w:t>
+            </w:r>
+          </w:p>
+        </w:tc>
+        <w:tc>
+          <w:tcPr>
+            <w:tcW w:type="dxa" w:w="1728"/>
+          </w:tcPr>
+          <w:p>
+            <w:r>
+              <w:t>Auth</w:t>
+            </w:r>
+          </w:p>
+        </w:tc>
+        <w:tc>
+          <w:tcPr>
+            <w:tcW w:type="dxa" w:w="1728"/>
+          </w:tcPr>
+          <w:p>
+            <w:r>
+              <w:t>Cakupan</w:t>
+            </w:r>
+          </w:p>
+        </w:tc>
+        <w:tc>
+          <w:tcPr>
+            <w:tcW w:type="dxa" w:w="1728"/>
+          </w:tcPr>
+          <w:p>
+            <w:r>
+              <w:t>Script scraper</w:t>
+            </w:r>
+          </w:p>
+        </w:tc>
+      </w:tr>
+      <w:tr>
+        <w:tc>
+          <w:tcPr>
+            <w:tcW w:type="dxa" w:w="1728"/>
+          </w:tcPr>
+          <w:p>
+            <w:r>
+              <w:t>Kalibrr.id</w:t>
+            </w:r>
+          </w:p>
+        </w:tc>
+        <w:tc>
+          <w:tcPr>
+            <w:tcW w:type="dxa" w:w="1728"/>
+          </w:tcPr>
+          <w:p>
+            <w:r>
+              <w:t>HTML SSR (__NEXT_DATA__)</w:t>
+            </w:r>
+          </w:p>
+        </w:tc>
+        <w:tc>
+          <w:tcPr>
+            <w:tcW w:type="dxa" w:w="1728"/>
+          </w:tcPr>
+          <w:p>
+            <w:r>
+              <w:t>Tidak ada</w:t>
+            </w:r>
+          </w:p>
+        </w:tc>
+        <w:tc>
+          <w:tcPr>
+            <w:tcW w:type="dxa" w:w="1728"/>
+          </w:tcPr>
+          <w:p>
+            <w:r>
+              <w:t>Indonesia, 21 industri x 2 mode (umum + WFH)</w:t>
+            </w:r>
+          </w:p>
+        </w:tc>
+        <w:tc>
+          <w:tcPr>
+            <w:tcW w:type="dxa" w:w="1728"/>
+          </w:tcPr>
+          <w:p>
+            <w:r>
+              <w:t>scrapers/kalibrr_scraper.py</w:t>
+            </w:r>
+          </w:p>
+        </w:tc>
+      </w:tr>
+      <w:tr>
+        <w:tc>
+          <w:tcPr>
+            <w:tcW w:type="dxa" w:w="1728"/>
+          </w:tcPr>
+          <w:p>
+            <w:r>
+              <w:t>RemoteOK</w:t>
+            </w:r>
+          </w:p>
+        </w:tc>
+        <w:tc>
+          <w:tcPr>
+            <w:tcW w:type="dxa" w:w="1728"/>
+          </w:tcPr>
+          <w:p>
+            <w:r>
+              <w:t>REST JSON</w:t>
+            </w:r>
+          </w:p>
+        </w:tc>
+        <w:tc>
+          <w:tcPr>
+            <w:tcW w:type="dxa" w:w="1728"/>
+          </w:tcPr>
+          <w:p>
+            <w:r>
+              <w:t>Tidak ada</w:t>
+            </w:r>
+          </w:p>
+        </w:tc>
+        <w:tc>
+          <w:tcPr>
+            <w:tcW w:type="dxa" w:w="1728"/>
+          </w:tcPr>
+          <w:p>
+            <w:r>
+              <w:t>Global, semua lowongan remote (full feed)</w:t>
+            </w:r>
+          </w:p>
+        </w:tc>
+        <w:tc>
+          <w:tcPr>
+            <w:tcW w:type="dxa" w:w="1728"/>
+          </w:tcPr>
+          <w:p>
+            <w:r>
+              <w:t>scrapers/remoteok_scraper.py</w:t>
+            </w:r>
+          </w:p>
+        </w:tc>
+      </w:tr>
+      <w:tr>
+        <w:tc>
+          <w:tcPr>
+            <w:tcW w:type="dxa" w:w="1728"/>
+          </w:tcPr>
+          <w:p>
+            <w:r>
+              <w:t>arbeitnow.com</w:t>
+            </w:r>
+          </w:p>
+        </w:tc>
+        <w:tc>
+          <w:tcPr>
+            <w:tcW w:type="dxa" w:w="1728"/>
+          </w:tcPr>
+          <w:p>
+            <w:r>
+              <w:t>REST JSON (paginated)</w:t>
+            </w:r>
+          </w:p>
+        </w:tc>
+        <w:tc>
+          <w:tcPr>
+            <w:tcW w:type="dxa" w:w="1728"/>
+          </w:tcPr>
+          <w:p>
+            <w:r>
+              <w:t>Tidak ada</w:t>
+            </w:r>
+          </w:p>
+        </w:tc>
+        <w:tc>
+          <w:tcPr>
+            <w:tcW w:type="dxa" w:w="1728"/>
+          </w:tcPr>
+          <w:p>
+            <w:r>
+              <w:t>Global (fokus EU + remote), 10 halaman x 100</w:t>
+            </w:r>
+          </w:p>
+        </w:tc>
+        <w:tc>
+          <w:tcPr>
+            <w:tcW w:type="dxa" w:w="1728"/>
+          </w:tcPr>
+          <w:p>
+            <w:r>
+              <w:t>scrapers/arbeitnow_scraper.py</w:t>
+            </w:r>
+          </w:p>
+        </w:tc>
+      </w:tr>
+      <w:tr>
+        <w:tc>
+          <w:tcPr>
+            <w:tcW w:type="dxa" w:w="1728"/>
+          </w:tcPr>
+          <w:p>
+            <w:r>
+              <w:t>Jobicy.com</w:t>
+            </w:r>
+          </w:p>
+        </w:tc>
+        <w:tc>
+          <w:tcPr>
+            <w:tcW w:type="dxa" w:w="1728"/>
+          </w:tcPr>
+          <w:p>
+            <w:r>
+              <w:t>REST JSON</w:t>
+            </w:r>
+          </w:p>
+        </w:tc>
+        <w:tc>
+          <w:tcPr>
+            <w:tcW w:type="dxa" w:w="1728"/>
+          </w:tcPr>
+          <w:p>
+            <w:r>
+              <w:t>Tidak ada</w:t>
+            </w:r>
+          </w:p>
+        </w:tc>
+        <w:tc>
+          <w:tcPr>
+            <w:tcW w:type="dxa" w:w="1728"/>
+          </w:tcPr>
+          <w:p>
+            <w:r>
+              <w:t>Global remote, 15 industri x 100</w:t>
+            </w:r>
+          </w:p>
+        </w:tc>
+        <w:tc>
+          <w:tcPr>
+            <w:tcW w:type="dxa" w:w="1728"/>
+          </w:tcPr>
+          <w:p>
+            <w:r>
+              <w:t>scrapers/jobicy_scraper.py</w:t>
+            </w:r>
+          </w:p>
+        </w:tc>
+      </w:tr>
+      <w:tr>
+        <w:tc>
+          <w:tcPr>
+            <w:tcW w:type="dxa" w:w="1728"/>
+          </w:tcPr>
+          <w:p>
+            <w:r>
+              <w:t>WeWorkRemotely</w:t>
+            </w:r>
+          </w:p>
+        </w:tc>
+        <w:tc>
+          <w:tcPr>
+            <w:tcW w:type="dxa" w:w="1728"/>
+          </w:tcPr>
+          <w:p>
+            <w:r>
+              <w:t>RSS XML</w:t>
+            </w:r>
+          </w:p>
+        </w:tc>
+        <w:tc>
+          <w:tcPr>
+            <w:tcW w:type="dxa" w:w="1728"/>
+          </w:tcPr>
+          <w:p>
+            <w:r>
+              <w:t>Tidak ada</w:t>
+            </w:r>
+          </w:p>
+        </w:tc>
+        <w:tc>
+          <w:tcPr>
+            <w:tcW w:type="dxa" w:w="1728"/>
+          </w:tcPr>
+          <w:p>
+            <w:r>
+              <w:t>Global remote, 8 kategori (programming, design, sales, dsb)</w:t>
+            </w:r>
+          </w:p>
+        </w:tc>
+        <w:tc>
+          <w:tcPr>
+            <w:tcW w:type="dxa" w:w="1728"/>
+          </w:tcPr>
+          <w:p>
+            <w:r>
+              <w:t>scrapers/weworkremotely_scraper.py</w:t>
+            </w:r>
+          </w:p>
+        </w:tc>
+      </w:tr>
+      <w:tr>
+        <w:tc>
+          <w:tcPr>
+            <w:tcW w:type="dxa" w:w="1728"/>
+          </w:tcPr>
+          <w:p>
+            <w:r>
+              <w:t>Adzuna.com</w:t>
+            </w:r>
+          </w:p>
+        </w:tc>
+        <w:tc>
+          <w:tcPr>
+            <w:tcW w:type="dxa" w:w="1728"/>
+          </w:tcPr>
+          <w:p>
+            <w:r>
+              <w:t>REST JSON</w:t>
+            </w:r>
+          </w:p>
+        </w:tc>
+        <w:tc>
+          <w:tcPr>
+            <w:tcW w:type="dxa" w:w="1728"/>
+          </w:tcPr>
+          <w:p>
+            <w:r>
+              <w:t>API key (gratis)</w:t>
+            </w:r>
+          </w:p>
+        </w:tc>
+        <w:tc>
+          <w:tcPr>
+            <w:tcW w:type="dxa" w:w="1728"/>
+          </w:tcPr>
+          <w:p>
+            <w:r>
+              <w:t>Indonesia, sweep 20 kata kunci</w:t>
+            </w:r>
+          </w:p>
+        </w:tc>
+        <w:tc>
+          <w:tcPr>
+            <w:tcW w:type="dxa" w:w="1728"/>
+          </w:tcPr>
+          <w:p>
+            <w:r>
+              <w:t>scrapers/adzuna_scraper.py</w:t>
+            </w:r>
+          </w:p>
+        </w:tc>
+      </w:tr>
+    </w:tbl>
+    <w:p>
+      <w:pPr>
+        <w:pStyle w:val="Heading2"/>
+      </w:pPr>
+      <w:r>
+        <w:t>12.2 Endpoint API yang dipakai</w:t>
+      </w:r>
+    </w:p>
+    <w:tbl>
+      <w:tblPr>
+        <w:tblStyle w:val="LightGrid-Accent1"/>
+        <w:tblW w:type="auto" w:w="0"/>
+        <w:tblLook w:firstColumn="1" w:firstRow="1" w:lastColumn="0" w:lastRow="0" w:noHBand="0" w:noVBand="1" w:val="04A0"/>
+      </w:tblPr>
+      <w:tblGrid>
+        <w:gridCol w:w="2160"/>
+        <w:gridCol w:w="2160"/>
+        <w:gridCol w:w="2160"/>
+        <w:gridCol w:w="2160"/>
+      </w:tblGrid>
+      <w:tr>
+        <w:tc>
+          <w:tcPr>
+            <w:tcW w:type="dxa" w:w="2160"/>
+          </w:tcPr>
+          <w:p>
+            <w:r>
+              <w:t>Sumber</w:t>
+            </w:r>
+          </w:p>
+        </w:tc>
+        <w:tc>
+          <w:tcPr>
+            <w:tcW w:type="dxa" w:w="2160"/>
+          </w:tcPr>
+          <w:p>
+            <w:r>
+              <w:t>Endpoint</w:t>
+            </w:r>
+          </w:p>
+        </w:tc>
+        <w:tc>
+          <w:tcPr>
+            <w:tcW w:type="dxa" w:w="2160"/>
+          </w:tcPr>
+          <w:p>
+            <w:r>
+              <w:t>Method</w:t>
+            </w:r>
+          </w:p>
+        </w:tc>
+        <w:tc>
+          <w:tcPr>
+            <w:tcW w:type="dxa" w:w="2160"/>
+          </w:tcPr>
+          <w:p>
+            <w:r>
+              <w:t>Query params penting</w:t>
+            </w:r>
+          </w:p>
+        </w:tc>
+      </w:tr>
+      <w:tr>
+        <w:tc>
+          <w:tcPr>
+            <w:tcW w:type="dxa" w:w="2160"/>
+          </w:tcPr>
+          <w:p>
+            <w:r>
+              <w:t>Kalibrr</w:t>
+            </w:r>
+          </w:p>
+        </w:tc>
+        <w:tc>
+          <w:tcPr>
+            <w:tcW w:type="dxa" w:w="2160"/>
+          </w:tcPr>
+          <w:p>
+            <w:r>
+              <w:t>https://www.kalibrr.id/job-board/i/&lt;industry&gt;/&lt;page&gt;</w:t>
+            </w:r>
+          </w:p>
+        </w:tc>
+        <w:tc>
+          <w:tcPr>
+            <w:tcW w:type="dxa" w:w="2160"/>
+          </w:tcPr>
+          <w:p>
+            <w:r>
+              <w:t>GET (HTML)</w:t>
+            </w:r>
+          </w:p>
+        </w:tc>
+        <w:tc>
+          <w:tcPr>
+            <w:tcW w:type="dxa" w:w="2160"/>
+          </w:tcPr>
+          <w:p>
+            <w:r>
+              <w:t>industry, work_from_home</w:t>
+            </w:r>
+          </w:p>
+        </w:tc>
+      </w:tr>
+      <w:tr>
+        <w:tc>
+          <w:tcPr>
+            <w:tcW w:type="dxa" w:w="2160"/>
+          </w:tcPr>
+          <w:p>
+            <w:r>
+              <w:t>RemoteOK</w:t>
+            </w:r>
+          </w:p>
+        </w:tc>
+        <w:tc>
+          <w:tcPr>
+            <w:tcW w:type="dxa" w:w="2160"/>
+          </w:tcPr>
+          <w:p>
+            <w:r>
+              <w:t>https://remoteok.com/api</w:t>
+            </w:r>
+          </w:p>
+        </w:tc>
+        <w:tc>
+          <w:tcPr>
+            <w:tcW w:type="dxa" w:w="2160"/>
+          </w:tcPr>
+          <w:p>
+            <w:r>
+              <w:t>GET</w:t>
+            </w:r>
+          </w:p>
+        </w:tc>
+        <w:tc>
+          <w:tcPr>
+            <w:tcW w:type="dxa" w:w="2160"/>
+          </w:tcPr>
+          <w:p>
+            <w:r>
+              <w:t>(tanpa parameter)</w:t>
+            </w:r>
+          </w:p>
+        </w:tc>
+      </w:tr>
+      <w:tr>
+        <w:tc>
+          <w:tcPr>
+            <w:tcW w:type="dxa" w:w="2160"/>
+          </w:tcPr>
+          <w:p>
+            <w:r>
+              <w:t>arbeitnow</w:t>
+            </w:r>
+          </w:p>
+        </w:tc>
+        <w:tc>
+          <w:tcPr>
+            <w:tcW w:type="dxa" w:w="2160"/>
+          </w:tcPr>
+          <w:p>
+            <w:r>
+              <w:t>https://www.arbeitnow.com/api/job-board-api</w:t>
+            </w:r>
+          </w:p>
+        </w:tc>
+        <w:tc>
+          <w:tcPr>
+            <w:tcW w:type="dxa" w:w="2160"/>
+          </w:tcPr>
+          <w:p>
+            <w:r>
+              <w:t>GET</w:t>
+            </w:r>
+          </w:p>
+        </w:tc>
+        <w:tc>
+          <w:tcPr>
+            <w:tcW w:type="dxa" w:w="2160"/>
+          </w:tcPr>
+          <w:p>
+            <w:r>
+              <w:t>?page=N</w:t>
+            </w:r>
+          </w:p>
+        </w:tc>
+      </w:tr>
+      <w:tr>
+        <w:tc>
+          <w:tcPr>
+            <w:tcW w:type="dxa" w:w="2160"/>
+          </w:tcPr>
+          <w:p>
+            <w:r>
+              <w:t>Jobicy</w:t>
+            </w:r>
+          </w:p>
+        </w:tc>
+        <w:tc>
+          <w:tcPr>
+            <w:tcW w:type="dxa" w:w="2160"/>
+          </w:tcPr>
+          <w:p>
+            <w:r>
+              <w:t>https://jobicy.com/api/v2/remote-jobs</w:t>
+            </w:r>
+          </w:p>
+        </w:tc>
+        <w:tc>
+          <w:tcPr>
+            <w:tcW w:type="dxa" w:w="2160"/>
+          </w:tcPr>
+          <w:p>
+            <w:r>
+              <w:t>GET</w:t>
+            </w:r>
+          </w:p>
+        </w:tc>
+        <w:tc>
+          <w:tcPr>
+            <w:tcW w:type="dxa" w:w="2160"/>
+          </w:tcPr>
+          <w:p>
+            <w:r>
+              <w:t>?count=100&amp;industry=...&amp;geo=...</w:t>
+            </w:r>
+          </w:p>
+        </w:tc>
+      </w:tr>
+      <w:tr>
+        <w:tc>
+          <w:tcPr>
+            <w:tcW w:type="dxa" w:w="2160"/>
+          </w:tcPr>
+          <w:p>
+            <w:r>
+              <w:t>WWR (RSS)</w:t>
+            </w:r>
+          </w:p>
+        </w:tc>
+        <w:tc>
+          <w:tcPr>
+            <w:tcW w:type="dxa" w:w="2160"/>
+          </w:tcPr>
+          <w:p>
+            <w:r>
+              <w:t>https://weworkremotely.com/categories/&lt;slug&gt;.rss</w:t>
+            </w:r>
+          </w:p>
+        </w:tc>
+        <w:tc>
+          <w:tcPr>
+            <w:tcW w:type="dxa" w:w="2160"/>
+          </w:tcPr>
+          <w:p>
+            <w:r>
+              <w:t>GET</w:t>
+            </w:r>
+          </w:p>
+        </w:tc>
+        <w:tc>
+          <w:tcPr>
+            <w:tcW w:type="dxa" w:w="2160"/>
+          </w:tcPr>
+          <w:p>
+            <w:r>
+              <w:t>(tanpa parameter)</w:t>
+            </w:r>
+          </w:p>
+        </w:tc>
+      </w:tr>
+      <w:tr>
+        <w:tc>
+          <w:tcPr>
+            <w:tcW w:type="dxa" w:w="2160"/>
+          </w:tcPr>
+          <w:p>
+            <w:r>
+              <w:t>Adzuna</w:t>
+            </w:r>
+          </w:p>
+        </w:tc>
+        <w:tc>
+          <w:tcPr>
+            <w:tcW w:type="dxa" w:w="2160"/>
+          </w:tcPr>
+          <w:p>
+            <w:r>
+              <w:t>https://api.adzuna.com/v1/api/jobs/id/search/&lt;page&gt;</w:t>
+            </w:r>
+          </w:p>
+        </w:tc>
+        <w:tc>
+          <w:tcPr>
+            <w:tcW w:type="dxa" w:w="2160"/>
+          </w:tcPr>
+          <w:p>
+            <w:r>
+              <w:t>GET</w:t>
+            </w:r>
+          </w:p>
+        </w:tc>
+        <w:tc>
+          <w:tcPr>
+            <w:tcW w:type="dxa" w:w="2160"/>
+          </w:tcPr>
+          <w:p>
+            <w:r>
+              <w:t>app_id, app_key, results_per_page, what</w:t>
+            </w:r>
+          </w:p>
+        </w:tc>
+      </w:tr>
+    </w:tbl>
+    <w:p>
+      <w:pPr>
+        <w:pStyle w:val="Heading2"/>
+      </w:pPr>
+      <w:r>
+        <w:t>12.3 Field yang diambil</w:t>
+      </w:r>
+    </w:p>
+    <w:p>
+      <w:r>
+        <w:rPr>
+          <w:sz w:val="22"/>
+        </w:rPr>
+        <w:t>Berikut field yang berhasil di-mapping ke kolom database. Field yang tidak ada di sumber bernilai NULL.</w:t>
+      </w:r>
+    </w:p>
+    <w:tbl>
+      <w:tblPr>
+        <w:tblStyle w:val="LightGrid-Accent1"/>
+        <w:tblW w:type="auto" w:w="0"/>
+        <w:tblLook w:firstColumn="1" w:firstRow="1" w:lastColumn="0" w:lastRow="0" w:noHBand="0" w:noVBand="1" w:val="04A0"/>
+      </w:tblPr>
+      <w:tblGrid>
+        <w:gridCol w:w="1234"/>
+        <w:gridCol w:w="1234"/>
+        <w:gridCol w:w="1234"/>
+        <w:gridCol w:w="1234"/>
+        <w:gridCol w:w="1234"/>
+        <w:gridCol w:w="1234"/>
+        <w:gridCol w:w="1234"/>
+      </w:tblGrid>
+      <w:tr>
+        <w:tc>
+          <w:tcPr>
+            <w:tcW w:type="dxa" w:w="1234"/>
+          </w:tcPr>
+          <w:p>
+            <w:r>
+              <w:t>Kolom DB</w:t>
+            </w:r>
+          </w:p>
+        </w:tc>
+        <w:tc>
+          <w:tcPr>
+            <w:tcW w:type="dxa" w:w="1234"/>
+          </w:tcPr>
+          <w:p>
+            <w:r>
+              <w:t>Kalibrr</w:t>
+            </w:r>
+          </w:p>
+        </w:tc>
+        <w:tc>
+          <w:tcPr>
+            <w:tcW w:type="dxa" w:w="1234"/>
+          </w:tcPr>
+          <w:p>
+            <w:r>
+              <w:t>RemoteOK</w:t>
+            </w:r>
+          </w:p>
+        </w:tc>
+        <w:tc>
+          <w:tcPr>
+            <w:tcW w:type="dxa" w:w="1234"/>
+          </w:tcPr>
+          <w:p>
+            <w:r>
+              <w:t>arbeitnow</w:t>
+            </w:r>
+          </w:p>
+        </w:tc>
+        <w:tc>
+          <w:tcPr>
+            <w:tcW w:type="dxa" w:w="1234"/>
+          </w:tcPr>
+          <w:p>
+            <w:r>
+              <w:t>Jobicy</w:t>
+            </w:r>
+          </w:p>
+        </w:tc>
+        <w:tc>
+          <w:tcPr>
+            <w:tcW w:type="dxa" w:w="1234"/>
+          </w:tcPr>
+          <w:p>
+            <w:r>
+              <w:t>WWR</w:t>
+            </w:r>
+          </w:p>
+        </w:tc>
+        <w:tc>
+          <w:tcPr>
+            <w:tcW w:type="dxa" w:w="1234"/>
+          </w:tcPr>
+          <w:p>
+            <w:r>
+              <w:t>Adzuna</w:t>
+            </w:r>
+          </w:p>
+        </w:tc>
+      </w:tr>
+      <w:tr>
+        <w:tc>
+          <w:tcPr>
+            <w:tcW w:type="dxa" w:w="1234"/>
+          </w:tcPr>
+          <w:p>
+            <w:r>
+              <w:t>title</w:t>
+            </w:r>
+          </w:p>
+        </w:tc>
+        <w:tc>
+          <w:tcPr>
+            <w:tcW w:type="dxa" w:w="1234"/>
+          </w:tcPr>
+          <w:p>
+            <w:r>
+              <w:t>name</w:t>
+            </w:r>
+          </w:p>
+        </w:tc>
+        <w:tc>
+          <w:tcPr>
+            <w:tcW w:type="dxa" w:w="1234"/>
+          </w:tcPr>
+          <w:p>
+            <w:r>
+              <w:t>position</w:t>
+            </w:r>
+          </w:p>
+        </w:tc>
+        <w:tc>
+          <w:tcPr>
+            <w:tcW w:type="dxa" w:w="1234"/>
+          </w:tcPr>
+          <w:p>
+            <w:r>
+              <w:t>title</w:t>
+            </w:r>
+          </w:p>
+        </w:tc>
+        <w:tc>
+          <w:tcPr>
+            <w:tcW w:type="dxa" w:w="1234"/>
+          </w:tcPr>
+          <w:p>
+            <w:r>
+              <w:t>jobTitle</w:t>
+            </w:r>
+          </w:p>
+        </w:tc>
+        <w:tc>
+          <w:tcPr>
+            <w:tcW w:type="dxa" w:w="1234"/>
+          </w:tcPr>
+          <w:p>
+            <w:r>
+              <w:t>title (split ':')</w:t>
+            </w:r>
+          </w:p>
+        </w:tc>
+        <w:tc>
+          <w:tcPr>
+            <w:tcW w:type="dxa" w:w="1234"/>
+          </w:tcPr>
+          <w:p>
+            <w:r>
+              <w:t>title</w:t>
+            </w:r>
+          </w:p>
+        </w:tc>
+      </w:tr>
+      <w:tr>
+        <w:tc>
+          <w:tcPr>
+            <w:tcW w:type="dxa" w:w="1234"/>
+          </w:tcPr>
+          <w:p>
+            <w:r>
+              <w:t>company_name</w:t>
+            </w:r>
+          </w:p>
+        </w:tc>
+        <w:tc>
+          <w:tcPr>
+            <w:tcW w:type="dxa" w:w="1234"/>
+          </w:tcPr>
+          <w:p>
+            <w:r>
+              <w:t>company.name</w:t>
+            </w:r>
+          </w:p>
+        </w:tc>
+        <w:tc>
+          <w:tcPr>
+            <w:tcW w:type="dxa" w:w="1234"/>
+          </w:tcPr>
+          <w:p>
+            <w:r>
+              <w:t>company</w:t>
+            </w:r>
+          </w:p>
+        </w:tc>
+        <w:tc>
+          <w:tcPr>
+            <w:tcW w:type="dxa" w:w="1234"/>
+          </w:tcPr>
+          <w:p>
+            <w:r>
+              <w:t>company_name</w:t>
+            </w:r>
+          </w:p>
+        </w:tc>
+        <w:tc>
+          <w:tcPr>
+            <w:tcW w:type="dxa" w:w="1234"/>
+          </w:tcPr>
+          <w:p>
+            <w:r>
+              <w:t>companyName</w:t>
+            </w:r>
+          </w:p>
+        </w:tc>
+        <w:tc>
+          <w:tcPr>
+            <w:tcW w:type="dxa" w:w="1234"/>
+          </w:tcPr>
+          <w:p>
+            <w:r>
+              <w:t>title prefix</w:t>
+            </w:r>
+          </w:p>
+        </w:tc>
+        <w:tc>
+          <w:tcPr>
+            <w:tcW w:type="dxa" w:w="1234"/>
+          </w:tcPr>
+          <w:p>
+            <w:r>
+              <w:t>company.display_name</w:t>
+            </w:r>
+          </w:p>
+        </w:tc>
+      </w:tr>
+      <w:tr>
+        <w:tc>
+          <w:tcPr>
+            <w:tcW w:type="dxa" w:w="1234"/>
+          </w:tcPr>
+          <w:p>
+            <w:r>
+              <w:t>description</w:t>
+            </w:r>
+          </w:p>
+        </w:tc>
+        <w:tc>
+          <w:tcPr>
+            <w:tcW w:type="dxa" w:w="1234"/>
+          </w:tcPr>
+          <w:p>
+            <w:r>
+              <w:t>description (HTML)</w:t>
+            </w:r>
+          </w:p>
+        </w:tc>
+        <w:tc>
+          <w:tcPr>
+            <w:tcW w:type="dxa" w:w="1234"/>
+          </w:tcPr>
+          <w:p>
+            <w:r>
+              <w:t>description (HTML)</w:t>
+            </w:r>
+          </w:p>
+        </w:tc>
+        <w:tc>
+          <w:tcPr>
+            <w:tcW w:type="dxa" w:w="1234"/>
+          </w:tcPr>
+          <w:p>
+            <w:r>
+              <w:t>description (HTML)</w:t>
+            </w:r>
+          </w:p>
+        </w:tc>
+        <w:tc>
+          <w:tcPr>
+            <w:tcW w:type="dxa" w:w="1234"/>
+          </w:tcPr>
+          <w:p>
+            <w:r>
+              <w:t>jobDescription</w:t>
+            </w:r>
+          </w:p>
+        </w:tc>
+        <w:tc>
+          <w:tcPr>
+            <w:tcW w:type="dxa" w:w="1234"/>
+          </w:tcPr>
+          <w:p>
+            <w:r>
+              <w:t>description (RSS)</w:t>
+            </w:r>
+          </w:p>
+        </w:tc>
+        <w:tc>
+          <w:tcPr>
+            <w:tcW w:type="dxa" w:w="1234"/>
+          </w:tcPr>
+          <w:p>
+            <w:r>
+              <w:t>description (HTML)</w:t>
+            </w:r>
+          </w:p>
+        </w:tc>
+      </w:tr>
+      <w:tr>
+        <w:tc>
+          <w:tcPr>
+            <w:tcW w:type="dxa" w:w="1234"/>
+          </w:tcPr>
+          <w:p>
+            <w:r>
+              <w:t>requirements</w:t>
+            </w:r>
+          </w:p>
+        </w:tc>
+        <w:tc>
+          <w:tcPr>
+            <w:tcW w:type="dxa" w:w="1234"/>
+          </w:tcPr>
+          <w:p>
+            <w:r>
+              <w:t>qualifications + Sumber</w:t>
+            </w:r>
+          </w:p>
+        </w:tc>
+        <w:tc>
+          <w:tcPr>
+            <w:tcW w:type="dxa" w:w="1234"/>
+          </w:tcPr>
+          <w:p>
+            <w:r>
+              <w:t>tags + Sumber</w:t>
+            </w:r>
+          </w:p>
+        </w:tc>
+        <w:tc>
+          <w:tcPr>
+            <w:tcW w:type="dxa" w:w="1234"/>
+          </w:tcPr>
+          <w:p>
+            <w:r>
+              <w:t>Sumber link</w:t>
+            </w:r>
+          </w:p>
+        </w:tc>
+        <w:tc>
+          <w:tcPr>
+            <w:tcW w:type="dxa" w:w="1234"/>
+          </w:tcPr>
+          <w:p>
+            <w:r>
+              <w:t>Sumber link</w:t>
+            </w:r>
+          </w:p>
+        </w:tc>
+        <w:tc>
+          <w:tcPr>
+            <w:tcW w:type="dxa" w:w="1234"/>
+          </w:tcPr>
+          <w:p>
+            <w:r>
+              <w:t>Sumber link</w:t>
+            </w:r>
+          </w:p>
+        </w:tc>
+        <w:tc>
+          <w:tcPr>
+            <w:tcW w:type="dxa" w:w="1234"/>
+          </w:tcPr>
+          <w:p>
+            <w:r>
+              <w:t>Sumber link</w:t>
+            </w:r>
+          </w:p>
+        </w:tc>
+      </w:tr>
+      <w:tr>
+        <w:tc>
+          <w:tcPr>
+            <w:tcW w:type="dxa" w:w="1234"/>
+          </w:tcPr>
+          <w:p>
+            <w:r>
+              <w:t>country</w:t>
+            </w:r>
+          </w:p>
+        </w:tc>
+        <w:tc>
+          <w:tcPr>
+            <w:tcW w:type="dxa" w:w="1234"/>
+          </w:tcPr>
+          <w:p>
+            <w:r>
+              <w:t>googleLocation.country</w:t>
+            </w:r>
+          </w:p>
+        </w:tc>
+        <w:tc>
+          <w:tcPr>
+            <w:tcW w:type="dxa" w:w="1234"/>
+          </w:tcPr>
+          <w:p>
+            <w:r>
+              <w:t>heuristik dari location</w:t>
+            </w:r>
+          </w:p>
+        </w:tc>
+        <w:tc>
+          <w:tcPr>
+            <w:tcW w:type="dxa" w:w="1234"/>
+          </w:tcPr>
+          <w:p>
+            <w:r>
+              <w:t>heuristik</w:t>
+            </w:r>
+          </w:p>
+        </w:tc>
+        <w:tc>
+          <w:tcPr>
+            <w:tcW w:type="dxa" w:w="1234"/>
+          </w:tcPr>
+          <w:p>
+            <w:r>
+              <w:t>heuristik dari jobGeo</w:t>
+            </w:r>
+          </w:p>
+        </w:tc>
+        <w:tc>
+          <w:tcPr>
+            <w:tcW w:type="dxa" w:w="1234"/>
+          </w:tcPr>
+          <w:p>
+            <w:r>
+              <w:t>region</w:t>
+            </w:r>
+          </w:p>
+        </w:tc>
+        <w:tc>
+          <w:tcPr>
+            <w:tcW w:type="dxa" w:w="1234"/>
+          </w:tcPr>
+          <w:p>
+            <w:r>
+              <w:t>Indonesia</w:t>
+            </w:r>
+          </w:p>
+        </w:tc>
+      </w:tr>
+      <w:tr>
+        <w:tc>
+          <w:tcPr>
+            <w:tcW w:type="dxa" w:w="1234"/>
+          </w:tcPr>
+          <w:p>
+            <w:r>
+              <w:t>province</w:t>
+            </w:r>
+          </w:p>
+        </w:tc>
+        <w:tc>
+          <w:tcPr>
+            <w:tcW w:type="dxa" w:w="1234"/>
+          </w:tcPr>
+          <w:p>
+            <w:r>
+              <w:t>googleLocation.region (normalized)</w:t>
+            </w:r>
+          </w:p>
+        </w:tc>
+        <w:tc>
+          <w:tcPr>
+            <w:tcW w:type="dxa" w:w="1234"/>
+          </w:tcPr>
+          <w:p>
+            <w:r>
+              <w:t>-</w:t>
+            </w:r>
+          </w:p>
+        </w:tc>
+        <w:tc>
+          <w:tcPr>
+            <w:tcW w:type="dxa" w:w="1234"/>
+          </w:tcPr>
+          <w:p>
+            <w:r>
+              <w:t>-</w:t>
+            </w:r>
+          </w:p>
+        </w:tc>
+        <w:tc>
+          <w:tcPr>
+            <w:tcW w:type="dxa" w:w="1234"/>
+          </w:tcPr>
+          <w:p>
+            <w:r>
+              <w:t>-</w:t>
+            </w:r>
+          </w:p>
+        </w:tc>
+        <w:tc>
+          <w:tcPr>
+            <w:tcW w:type="dxa" w:w="1234"/>
+          </w:tcPr>
+          <w:p>
+            <w:r>
+              <w:t>-</w:t>
+            </w:r>
+          </w:p>
+        </w:tc>
+        <w:tc>
+          <w:tcPr>
+            <w:tcW w:type="dxa" w:w="1234"/>
+          </w:tcPr>
+          <w:p>
+            <w:r>
+              <w:t>location.area[1] (normalized)</w:t>
+            </w:r>
+          </w:p>
+        </w:tc>
+      </w:tr>
+      <w:tr>
+        <w:tc>
+          <w:tcPr>
+            <w:tcW w:type="dxa" w:w="1234"/>
+          </w:tcPr>
+          <w:p>
+            <w:r>
+              <w:t>city</w:t>
+            </w:r>
+          </w:p>
+        </w:tc>
+        <w:tc>
+          <w:tcPr>
+            <w:tcW w:type="dxa" w:w="1234"/>
+          </w:tcPr>
+          <w:p>
+            <w:r>
+              <w:t>googleLocation.city (normalized)</w:t>
+            </w:r>
+          </w:p>
+        </w:tc>
+        <w:tc>
+          <w:tcPr>
+            <w:tcW w:type="dxa" w:w="1234"/>
+          </w:tcPr>
+          <w:p>
+            <w:r>
+              <w:t>location</w:t>
+            </w:r>
+          </w:p>
+        </w:tc>
+        <w:tc>
+          <w:tcPr>
+            <w:tcW w:type="dxa" w:w="1234"/>
+          </w:tcPr>
+          <w:p>
+            <w:r>
+              <w:t>location</w:t>
+            </w:r>
+          </w:p>
+        </w:tc>
+        <w:tc>
+          <w:tcPr>
+            <w:tcW w:type="dxa" w:w="1234"/>
+          </w:tcPr>
+          <w:p>
+            <w:r>
+              <w:t>jobGeo</w:t>
+            </w:r>
+          </w:p>
+        </w:tc>
+        <w:tc>
+          <w:tcPr>
+            <w:tcW w:type="dxa" w:w="1234"/>
+          </w:tcPr>
+          <w:p>
+            <w:r>
+              <w:t>region</w:t>
+            </w:r>
+          </w:p>
+        </w:tc>
+        <w:tc>
+          <w:tcPr>
+            <w:tcW w:type="dxa" w:w="1234"/>
+          </w:tcPr>
+          <w:p>
+            <w:r>
+              <w:t>location.area[2]</w:t>
+            </w:r>
+          </w:p>
+        </w:tc>
+      </w:tr>
+      <w:tr>
+        <w:tc>
+          <w:tcPr>
+            <w:tcW w:type="dxa" w:w="1234"/>
+          </w:tcPr>
+          <w:p>
+            <w:r>
+              <w:t>salary_min/max</w:t>
+            </w:r>
+          </w:p>
+        </w:tc>
+        <w:tc>
+          <w:tcPr>
+            <w:tcW w:type="dxa" w:w="1234"/>
+          </w:tcPr>
+          <w:p>
+            <w:r>
+              <w:t>baseSalary/maximumSalary (IDR only)</w:t>
+            </w:r>
+          </w:p>
+        </w:tc>
+        <w:tc>
+          <w:tcPr>
+            <w:tcW w:type="dxa" w:w="1234"/>
+          </w:tcPr>
+          <w:p>
+            <w:r>
+              <w:t>salary_min/max (USD/yr -&gt; IDR/bln)</w:t>
+            </w:r>
+          </w:p>
+        </w:tc>
+        <w:tc>
+          <w:tcPr>
+            <w:tcW w:type="dxa" w:w="1234"/>
+          </w:tcPr>
+          <w:p>
+            <w:r>
+              <w:t>-</w:t>
+            </w:r>
+          </w:p>
+        </w:tc>
+        <w:tc>
+          <w:tcPr>
+            <w:tcW w:type="dxa" w:w="1234"/>
+          </w:tcPr>
+          <w:p>
+            <w:r>
+              <w:t>salaryMin/Max</w:t>
+            </w:r>
+          </w:p>
+        </w:tc>
+        <w:tc>
+          <w:tcPr>
+            <w:tcW w:type="dxa" w:w="1234"/>
+          </w:tcPr>
+          <w:p>
+            <w:r>
+              <w:t>-</w:t>
+            </w:r>
+          </w:p>
+        </w:tc>
+        <w:tc>
+          <w:tcPr>
+            <w:tcW w:type="dxa" w:w="1234"/>
+          </w:tcPr>
+          <w:p>
+            <w:r>
+              <w:t>salary_min/max (IDR)</w:t>
+            </w:r>
+          </w:p>
+        </w:tc>
+      </w:tr>
+      <w:tr>
+        <w:tc>
+          <w:tcPr>
+            <w:tcW w:type="dxa" w:w="1234"/>
+          </w:tcPr>
+          <w:p>
+            <w:r>
+              <w:t>employment_type</w:t>
+            </w:r>
+          </w:p>
+        </w:tc>
+        <w:tc>
+          <w:tcPr>
+            <w:tcW w:type="dxa" w:w="1234"/>
+          </w:tcPr>
+          <w:p>
+            <w:r>
+              <w:t>tenure (mapped)</w:t>
+            </w:r>
+          </w:p>
+        </w:tc>
+        <w:tc>
+          <w:tcPr>
+            <w:tcW w:type="dxa" w:w="1234"/>
+          </w:tcPr>
+          <w:p>
+            <w:r>
+              <w:t>Remote</w:t>
+            </w:r>
+          </w:p>
+        </w:tc>
+        <w:tc>
+          <w:tcPr>
+            <w:tcW w:type="dxa" w:w="1234"/>
+          </w:tcPr>
+          <w:p>
+            <w:r>
+              <w:t>job_types[0]</w:t>
+            </w:r>
+          </w:p>
+        </w:tc>
+        <w:tc>
+          <w:tcPr>
+            <w:tcW w:type="dxa" w:w="1234"/>
+          </w:tcPr>
+          <w:p>
+            <w:r>
+              <w:t>jobType[0]</w:t>
+            </w:r>
+          </w:p>
+        </w:tc>
+        <w:tc>
+          <w:tcPr>
+            <w:tcW w:type="dxa" w:w="1234"/>
+          </w:tcPr>
+          <w:p>
+            <w:r>
+              <w:t>Remote</w:t>
+            </w:r>
+          </w:p>
+        </w:tc>
+        <w:tc>
+          <w:tcPr>
+            <w:tcW w:type="dxa" w:w="1234"/>
+          </w:tcPr>
+          <w:p>
+            <w:r>
+              <w:t>contract_time/contract_type</w:t>
+            </w:r>
+          </w:p>
+        </w:tc>
+      </w:tr>
+      <w:tr>
+        <w:tc>
+          <w:tcPr>
+            <w:tcW w:type="dxa" w:w="1234"/>
+          </w:tcPr>
+          <w:p>
+            <w:r>
+              <w:t>skills</w:t>
+            </w:r>
+          </w:p>
+        </w:tc>
+        <w:tc>
+          <w:tcPr>
+            <w:tcW w:type="dxa" w:w="1234"/>
+          </w:tcPr>
+          <w:p>
+            <w:r>
+              <w:t>-</w:t>
+            </w:r>
+          </w:p>
+        </w:tc>
+        <w:tc>
+          <w:tcPr>
+            <w:tcW w:type="dxa" w:w="1234"/>
+          </w:tcPr>
+          <w:p>
+            <w:r>
+              <w:t>tags (join ',')</w:t>
+            </w:r>
+          </w:p>
+        </w:tc>
+        <w:tc>
+          <w:tcPr>
+            <w:tcW w:type="dxa" w:w="1234"/>
+          </w:tcPr>
+          <w:p>
+            <w:r>
+              <w:t>tags (join ',')</w:t>
+            </w:r>
+          </w:p>
+        </w:tc>
+        <w:tc>
+          <w:tcPr>
+            <w:tcW w:type="dxa" w:w="1234"/>
+          </w:tcPr>
+          <w:p>
+            <w:r>
+              <w:t>-</w:t>
+            </w:r>
+          </w:p>
+        </w:tc>
+        <w:tc>
+          <w:tcPr>
+            <w:tcW w:type="dxa" w:w="1234"/>
+          </w:tcPr>
+          <w:p>
+            <w:r>
+              <w:t>-</w:t>
+            </w:r>
+          </w:p>
+        </w:tc>
+        <w:tc>
+          <w:tcPr>
+            <w:tcW w:type="dxa" w:w="1234"/>
+          </w:tcPr>
+          <w:p>
+            <w:r>
+              <w:t>-</w:t>
+            </w:r>
+          </w:p>
+        </w:tc>
+      </w:tr>
+      <w:tr>
+        <w:tc>
+          <w:tcPr>
+            <w:tcW w:type="dxa" w:w="1234"/>
+          </w:tcPr>
+          <w:p>
+            <w:r>
+              <w:t>min_experience</w:t>
+            </w:r>
+          </w:p>
+        </w:tc>
+        <w:tc>
+          <w:tcPr>
+            <w:tcW w:type="dxa" w:w="1234"/>
+          </w:tcPr>
+          <w:p>
+            <w:r>
+              <w:t>workExperience bucket (mapped)</w:t>
+            </w:r>
+          </w:p>
+        </w:tc>
+        <w:tc>
+          <w:tcPr>
+            <w:tcW w:type="dxa" w:w="1234"/>
+          </w:tcPr>
+          <w:p>
+            <w:r>
+              <w:t>0</w:t>
+            </w:r>
+          </w:p>
+        </w:tc>
+        <w:tc>
+          <w:tcPr>
+            <w:tcW w:type="dxa" w:w="1234"/>
+          </w:tcPr>
+          <w:p>
+            <w:r>
+              <w:t>0</w:t>
+            </w:r>
+          </w:p>
+        </w:tc>
+        <w:tc>
+          <w:tcPr>
+            <w:tcW w:type="dxa" w:w="1234"/>
+          </w:tcPr>
+          <w:p>
+            <w:r>
+              <w:t>0</w:t>
+            </w:r>
+          </w:p>
+        </w:tc>
+        <w:tc>
+          <w:tcPr>
+            <w:tcW w:type="dxa" w:w="1234"/>
+          </w:tcPr>
+          <w:p>
+            <w:r>
+              <w:t>0</w:t>
+            </w:r>
+          </w:p>
+        </w:tc>
+        <w:tc>
+          <w:tcPr>
+            <w:tcW w:type="dxa" w:w="1234"/>
+          </w:tcPr>
+          <w:p>
+            <w:r>
+              <w:t>0</w:t>
+            </w:r>
+          </w:p>
+        </w:tc>
+      </w:tr>
+    </w:tbl>
+    <w:p>
+      <w:pPr>
+        <w:pStyle w:val="Heading2"/>
+      </w:pPr>
+      <w:r>
+        <w:t>12.4 Contoh response Kalibrr (__NEXT_DATA__)</w:t>
+      </w:r>
+    </w:p>
+    <w:p>
+      <w:r>
+        <w:rPr>
+          <w:sz w:val="22"/>
+        </w:rPr>
+        <w:t>Kalibrr adalah Next.js SSR. Setiap halaman job-board memuat &lt;script id="__NEXT_DATA__"&gt; berisi JSON. Path job:</w:t>
+      </w:r>
+    </w:p>
+    <w:p>
+      <w:r>
+        <w:rPr>
+          <w:rFonts w:ascii="Consolas" w:hAnsi="Consolas"/>
+          <w:color w:val="111111"/>
+          <w:sz w:val="18"/>
+        </w:rPr>
+        <w:t>props.pageProps.jobs = [</w:t>
+        <w:br/>
+        <w:t xml:space="preserve">  {</w:t>
+        <w:br/>
+        <w:t xml:space="preserve">    id: 267040,</w:t>
+        <w:br/>
+        <w:t xml:space="preserve">    name: "Sales Canvassing EDC Klungkung",</w:t>
+        <w:br/>
+        <w:t xml:space="preserve">    slug: "sales-canvassing-edc-klungkung",</w:t>
+        <w:br/>
+        <w:t xml:space="preserve">    description: "&lt;p&gt;Mencari new sales/UMKM ...&lt;/p&gt;",</w:t>
+        <w:br/>
+        <w:t xml:space="preserve">    qualifications: "&lt;ul&gt;&lt;li&gt;Berpengalaman ...&lt;/li&gt;&lt;/ul&gt;",</w:t>
+        <w:br/>
+        <w:t xml:space="preserve">    tenure: "Full time",</w:t>
+        <w:br/>
+        <w:t xml:space="preserve">    workExperience: 200,           // 100|200|300|400 bucket</w:t>
+        <w:br/>
+        <w:t xml:space="preserve">    baseSalary: 5000000,</w:t>
+        <w:br/>
+        <w:t xml:space="preserve">    maximumSalary: 6000000,</w:t>
+        <w:br/>
+        <w:t xml:space="preserve">    salaryCurrency: "IDR",</w:t>
+        <w:br/>
+        <w:t xml:space="preserve">    salaryInterval: "month",</w:t>
+        <w:br/>
+        <w:t xml:space="preserve">    isWorkFromHome: false,</w:t>
+        <w:br/>
+        <w:t xml:space="preserve">    googleLocation: { addressComponents: {</w:t>
+        <w:br/>
+        <w:t xml:space="preserve">      country: "Indonesia", region: "Bali", city: "Klungkung"</w:t>
+        <w:br/>
+        <w:t xml:space="preserve">    }},</w:t>
+        <w:br/>
+        <w:t xml:space="preserve">    company: {</w:t>
+        <w:br/>
+        <w:t xml:space="preserve">      code: "buku-warung",</w:t>
+        <w:br/>
+        <w:t xml:space="preserve">      name: "Buku Warung",</w:t>
+        <w:br/>
+        <w:t xml:space="preserve">      industry: "Financial Services"</w:t>
+        <w:br/>
+        <w:t xml:space="preserve">    }</w:t>
+        <w:br/>
+        <w:t xml:space="preserve">  },</w:t>
+        <w:br/>
+        <w:t xml:space="preserve">  ...</w:t>
+        <w:br/>
+        <w:t>]</w:t>
+      </w:r>
+    </w:p>
+    <w:p>
+      <w:pPr>
+        <w:pStyle w:val="Heading2"/>
+      </w:pPr>
+      <w:r>
+        <w:t>12.5 Contoh response RemoteOK</w:t>
+      </w:r>
+    </w:p>
+    <w:p>
+      <w:r>
+        <w:rPr>
+          <w:rFonts w:ascii="Consolas" w:hAnsi="Consolas"/>
+          <w:color w:val="111111"/>
+          <w:sz w:val="18"/>
+        </w:rPr>
+        <w:t>GET https://remoteok.com/api</w:t>
+        <w:br/>
+        <w:t>[</w:t>
+        <w:br/>
+        <w:t xml:space="preserve">  { /* meta */ },</w:t>
+        <w:br/>
+        <w:t xml:space="preserve">  {</w:t>
+        <w:br/>
+        <w:t xml:space="preserve">    "id": "123456",</w:t>
+        <w:br/>
+        <w:t xml:space="preserve">    "slug": "forward-deployed-engineer-cohere",</w:t>
+        <w:br/>
+        <w:t xml:space="preserve">    "position": "Forward Deployed Engineer Agentic Platform",</w:t>
+        <w:br/>
+        <w:t xml:space="preserve">    "company": "Cohere",</w:t>
+        <w:br/>
+        <w:t xml:space="preserve">    "location": "",</w:t>
+        <w:br/>
+        <w:t xml:space="preserve">    "tags": ["engineer", "python", "llm"],</w:t>
+        <w:br/>
+        <w:t xml:space="preserve">    "description": "&lt;p&gt;...&lt;/p&gt;",</w:t>
+        <w:br/>
+        <w:t xml:space="preserve">    "salary_min": 150000, "salary_max": 200000,   // USD per year</w:t>
+        <w:br/>
+        <w:t xml:space="preserve">    "apply_url": "https://remoteok.com/l/123456"</w:t>
+        <w:br/>
+        <w:t xml:space="preserve">  }, ...</w:t>
+        <w:br/>
+        <w:t>]</w:t>
+      </w:r>
+    </w:p>
+    <w:p>
+      <w:pPr>
+        <w:pStyle w:val="Heading2"/>
+      </w:pPr>
+      <w:r>
+        <w:t>12.6 Contoh response arbeitnow</w:t>
+      </w:r>
+    </w:p>
+    <w:p>
+      <w:r>
+        <w:rPr>
+          <w:rFonts w:ascii="Consolas" w:hAnsi="Consolas"/>
+          <w:color w:val="111111"/>
+          <w:sz w:val="18"/>
+        </w:rPr>
+        <w:t>GET https://www.arbeitnow.com/api/job-board-api?page=1</w:t>
+        <w:br/>
+        <w:t>{</w:t>
+        <w:br/>
+        <w:t xml:space="preserve">  "data": [</w:t>
+        <w:br/>
+        <w:t xml:space="preserve">    {</w:t>
+        <w:br/>
+        <w:t xml:space="preserve">      "slug": "tech-lead-android-core-product-speechify-12345",</w:t>
+        <w:br/>
+        <w:t xml:space="preserve">      "company_name": "Speechify",</w:t>
+        <w:br/>
+        <w:t xml:space="preserve">      "title": "Tech Lead, Android Core Product",</w:t>
+        <w:br/>
+        <w:t xml:space="preserve">      "description": "&lt;p&gt;...&lt;/p&gt;",</w:t>
+        <w:br/>
+        <w:t xml:space="preserve">      "remote": false,</w:t>
+        <w:br/>
+        <w:t xml:space="preserve">      "location": "Munich, Bavaria, Germany",</w:t>
+        <w:br/>
+        <w:t xml:space="preserve">      "tags": ["android", "kotlin"],</w:t>
+        <w:br/>
+        <w:t xml:space="preserve">      "job_types": ["full-time"],</w:t>
+        <w:br/>
+        <w:t xml:space="preserve">      "created_at": 1715000000,</w:t>
+        <w:br/>
+        <w:t xml:space="preserve">      "url": "https://www.arbeitnow.com/view/..."</w:t>
+        <w:br/>
+        <w:t xml:space="preserve">    }, ...</w:t>
+        <w:br/>
+        <w:t xml:space="preserve">  ],</w:t>
+        <w:br/>
+        <w:t xml:space="preserve">  "meta": { "current_page": 1, "per_page": 100, "to": 100 }</w:t>
+        <w:br/>
+        <w:t>}</w:t>
+      </w:r>
+    </w:p>
+    <w:p>
+      <w:pPr>
+        <w:pStyle w:val="Heading2"/>
+      </w:pPr>
+      <w:r>
+        <w:t>12.7 Contoh response Jobicy</w:t>
+      </w:r>
+    </w:p>
+    <w:p>
+      <w:r>
+        <w:rPr>
+          <w:rFonts w:ascii="Consolas" w:hAnsi="Consolas"/>
+          <w:color w:val="111111"/>
+          <w:sz w:val="18"/>
+        </w:rPr>
+        <w:t>GET https://jobicy.com/api/v2/remote-jobs?count=100&amp;industry=marketing</w:t>
+        <w:br/>
+        <w:t>{</w:t>
+        <w:br/>
+        <w:t xml:space="preserve">  "jobCount": 100,</w:t>
+        <w:br/>
+        <w:t xml:space="preserve">  "jobs": [</w:t>
+        <w:br/>
+        <w:t xml:space="preserve">    {</w:t>
+        <w:br/>
+        <w:t xml:space="preserve">      "id": 144044,</w:t>
+        <w:br/>
+        <w:t xml:space="preserve">      "jobSlug": "144044-order-management-associate",</w:t>
+        <w:br/>
+        <w:t xml:space="preserve">      "jobTitle": "Order Management Associate",</w:t>
+        <w:br/>
+        <w:t xml:space="preserve">      "companyName": "EOS",</w:t>
+        <w:br/>
+        <w:t xml:space="preserve">      "jobIndustry": ["Admin &amp; Virtual Assistant"],</w:t>
+        <w:br/>
+        <w:t xml:space="preserve">      "jobType": ["Full-Time"],</w:t>
+        <w:br/>
+        <w:t xml:space="preserve">      "jobGeo": "USA",</w:t>
+        <w:br/>
+        <w:t xml:space="preserve">      "jobLevel": "Midweight",</w:t>
+        <w:br/>
+        <w:t xml:space="preserve">      "jobDescription": "&lt;p&gt;...&lt;/p&gt;",</w:t>
+        <w:br/>
+        <w:t xml:space="preserve">      "salaryMin": 50000, "salaryMax": 75000,</w:t>
+        <w:br/>
+        <w:t xml:space="preserve">      "salaryCurrency": "USD", "salaryPeriod": "yearly",</w:t>
+        <w:br/>
+        <w:t xml:space="preserve">      "url": "https://jobicy.com/jobs/..."</w:t>
+        <w:br/>
+        <w:t xml:space="preserve">    }, ...</w:t>
+        <w:br/>
+        <w:t xml:space="preserve">  ]</w:t>
+        <w:br/>
+        <w:t>}</w:t>
+      </w:r>
+    </w:p>
+    <w:p>
+      <w:pPr>
+        <w:pStyle w:val="Heading2"/>
+      </w:pPr>
+      <w:r>
+        <w:t>12.8 Contoh response Adzuna</w:t>
+      </w:r>
+    </w:p>
+    <w:p>
+      <w:r>
+        <w:rPr>
+          <w:rFonts w:ascii="Consolas" w:hAnsi="Consolas"/>
+          <w:color w:val="111111"/>
+          <w:sz w:val="18"/>
+        </w:rPr>
+        <w:t>GET https://api.adzuna.com/v1/api/jobs/id/search/1</w:t>
+        <w:br/>
+        <w:t xml:space="preserve">    ?app_id=YOUR_ID&amp;app_key=YOUR_KEY&amp;results_per_page=50&amp;what=developer</w:t>
+        <w:br/>
+        <w:t>{</w:t>
+        <w:br/>
+        <w:t xml:space="preserve">  "count": 1234,</w:t>
+        <w:br/>
+        <w:t xml:space="preserve">  "results": [</w:t>
+        <w:br/>
+        <w:t xml:space="preserve">    {</w:t>
+        <w:br/>
+        <w:t xml:space="preserve">      "id": "5078123456",</w:t>
+        <w:br/>
+        <w:t xml:space="preserve">      "title": "Backend Developer",</w:t>
+        <w:br/>
+        <w:t xml:space="preserve">      "company": { "display_name": "PT Tokopedia" },</w:t>
+        <w:br/>
+        <w:t xml:space="preserve">      "location": {</w:t>
+        <w:br/>
+        <w:t xml:space="preserve">        "display_name": "Jakarta Selatan",</w:t>
+        <w:br/>
+        <w:t xml:space="preserve">        "area": ["Indonesia", "DKI Jakarta", "Jakarta Selatan"]</w:t>
+        <w:br/>
+        <w:t xml:space="preserve">      },</w:t>
+        <w:br/>
+        <w:t xml:space="preserve">      "description": "...",</w:t>
+        <w:br/>
+        <w:t xml:space="preserve">      "category": { "label": "IT Jobs" },</w:t>
+        <w:br/>
+        <w:t xml:space="preserve">      "contract_type": "permanent", "contract_time": "full_time",</w:t>
+        <w:br/>
+        <w:t xml:space="preserve">      "salary_min": 15000000, "salary_max": 25000000,</w:t>
+        <w:br/>
+        <w:t xml:space="preserve">      "created": "2026-05-10T08:00:00Z",</w:t>
+        <w:br/>
+        <w:t xml:space="preserve">      "redirect_url": "https://www.adzuna.com/redirect/..."</w:t>
+        <w:br/>
+        <w:t xml:space="preserve">    }, ...</w:t>
+        <w:br/>
+        <w:t xml:space="preserve">  ]</w:t>
+        <w:br/>
+        <w:t>}</w:t>
+      </w:r>
+    </w:p>
+    <w:p>
+      <w:pPr>
+        <w:pStyle w:val="Heading2"/>
+      </w:pPr>
+      <w:r>
+        <w:t>12.9 Alur pipeline scraping &amp; import</w:t>
+      </w:r>
+    </w:p>
+    <w:p>
+      <w:pPr>
+        <w:pStyle w:val="ListBullet"/>
+      </w:pPr>
+      <w:r>
+        <w:t>1. Scraper Kalibrr menggunakan Playwright + Chrome CDP (port 29229) karena Kalibrr di-proteksi Cloudflare. Setiap URL kategori di-load, __NEXT_DATA__ di-ekstrak dengan document.querySelector, dan field di-pluck.</w:t>
+      </w:r>
+    </w:p>
+    <w:p>
+      <w:pPr>
+        <w:pStyle w:val="ListBullet"/>
+      </w:pPr>
+      <w:r>
+        <w:t>2. Scraper RemoteOK / arbeitnow / Jobicy / WWR menggunakan urllib.request standar — lebih ringan, tanpa browser.</w:t>
+      </w:r>
+    </w:p>
+    <w:p>
+      <w:pPr>
+        <w:pStyle w:val="ListBullet"/>
+      </w:pPr>
+      <w:r>
+        <w:t>3. Scraper Adzuna menggunakan urllib.request + dua env var (ADZUNA_APP_ID, ADZUNA_APP_KEY) dari kredensial gratis Adzuna Developer.</w:t>
+      </w:r>
+    </w:p>
+    <w:p>
+      <w:pPr>
+        <w:pStyle w:val="ListBullet"/>
+      </w:pPr>
+      <w:r>
+        <w:t>4. Hasil setiap scraper disimpan sebagai snapshot JSON di scrapers/data/&lt;source&gt;_jobs.json.</w:t>
+      </w:r>
+    </w:p>
+    <w:p>
+      <w:pPr>
+        <w:pStyle w:val="ListBullet"/>
+      </w:pPr>
+      <w:r>
+        <w:t>5. Importer (scrapers/import_kalibrr.py untuk Kalibrr, scrapers/import_external_jobs.py untuk sisanya) membaca JSON, melakukan dedup, dan INSERT ke tabel companies + jobs lewat helper backend.database.execute().</w:t>
+      </w:r>
+    </w:p>
+    <w:p>
+      <w:pPr>
+        <w:pStyle w:val="ListBullet"/>
+      </w:pPr>
+      <w:r>
+        <w:t>6. Importer bersifat idempotent: aman dijalankan berulang tanpa duplikasi.</w:t>
+      </w:r>
+    </w:p>
+    <w:p>
+      <w:pPr>
+        <w:pStyle w:val="Heading2"/>
+      </w:pPr>
+      <w:r>
+        <w:t>12.10 Cara menjalankan ulang scraping &amp; import</w:t>
+      </w:r>
+    </w:p>
+    <w:p>
+      <w:r>
+        <w:rPr>
+          <w:rFonts w:ascii="Consolas" w:hAnsi="Consolas"/>
+          <w:color w:val="111111"/>
+          <w:sz w:val="18"/>
+        </w:rPr>
+        <w:t># 1. Pastikan Chrome berjalan di port 29229 (hanya untuk Kalibrr)</w:t>
+        <w:br/>
+        <w:t>google-chrome --remote-debugging-port=29229 --user-data-dir=/tmp/cdp &amp;</w:t>
+        <w:br/>
+        <w:br/>
+        <w:t># 2. Jalankan semua scraper (paralel boleh)</w:t>
+        <w:br/>
+        <w:t>python scrapers/kalibrr_scraper.py --max-jobs 300</w:t>
+        <w:br/>
+        <w:t>python scrapers/remoteok_scraper.py</w:t>
+        <w:br/>
+        <w:t>python scrapers/arbeitnow_scraper.py 16</w:t>
+        <w:br/>
+        <w:t>python scrapers/jobicy_scraper.py</w:t>
+        <w:br/>
+        <w:t>python scrapers/weworkremotely_scraper.py</w:t>
+        <w:br/>
+        <w:t># Adzuna butuh API key gratis dari https://developer.adzuna.com/signup</w:t>
+        <w:br/>
+        <w:t>ADZUNA_APP_ID=xxx ADZUNA_APP_KEY=yyy python scrapers/adzuna_scraper.py</w:t>
+        <w:br/>
+        <w:br/>
+        <w:t># 3. Import ke SQLite (dedup otomatis)</w:t>
+        <w:br/>
+        <w:t>python scrapers/import_kalibrr.py</w:t>
+        <w:br/>
+        <w:t>python scrapers/import_external_jobs.py</w:t>
+      </w:r>
+    </w:p>
+    <w:p>
+      <w:pPr>
+        <w:pStyle w:val="Heading2"/>
+      </w:pPr>
+      <w:r>
+        <w:t>12.11 Catatan legal &amp; rate-limit</w:t>
+      </w:r>
+    </w:p>
+    <w:p>
+      <w:pPr>
+        <w:pStyle w:val="ListBullet"/>
+      </w:pPr>
+      <w:r>
+        <w:t>Semua sumber yang dipakai mengizinkan akses publik tanpa scraping ban di ToS-nya (RemoteOK API publik, arbeitnow API publik, Jobicy 'free public API', WWR RSS, Adzuna API key gratis). Untuk Kalibrr tidak ada API publik resmi, namun __NEXT_DATA__ disajikan ke browser apapun yang me-load halaman.</w:t>
+      </w:r>
+    </w:p>
+    <w:p>
+      <w:pPr>
+        <w:pStyle w:val="ListBullet"/>
+      </w:pPr>
+      <w:r>
+        <w:t>Rate limit diatur konservatif: 1.5-2 detik per URL untuk Kalibrr (rate-limited Playwright), 0.4 detik antar request untuk REST API.</w:t>
+      </w:r>
+    </w:p>
+    <w:p>
+      <w:pPr>
+        <w:pStyle w:val="ListBullet"/>
+      </w:pPr>
+      <w:r>
+        <w:t>Field 'Sumber: &lt;URL&gt;' selalu ditambahkan ke kolom requirements supaya kandidat dapat melamar langsung ke halaman job-board asli.</w:t>
+      </w:r>
+    </w:p>
+    <w:p>
+      <w:pPr>
+        <w:pStyle w:val="ListBullet"/>
+      </w:pPr>
+      <w:r>
+        <w:t>Daftar LinkedIn, Indeed, Glints, JobStreet, dan Kaggle TIDAK dipakai: LinkedIn/Indeed/Glints/JobStreet diblok oleh Cloudflare anti-bot dari cloud IP umum, sedangkan Kaggle bukan job board (platform kompetisi data science).</w:t>
+      </w:r>
+    </w:p>
+    <w:p>
+      <w:r>
         <w:rPr>
           <w:sz w:val="22"/>
         </w:rPr>

</xml_diff>